<commit_message>
fix(docs): corregir formato de los Word generados tras verificacion visual
Diario: eliminar salto de linea faltante que rompia el bullet "Fecha" (se
renderizaba como encabezado) y quitar el marcador interno "(borrador,
revisar)" que habia quedado en el analisis de las 3 entradas.

Plan de pruebas QA: pasar el documento a orientacion horizontal (la tabla
de 9 columnas con 74 casos era ilegible en vertical, con casi cada palabra
partida) y quitar la tabla de contenido automatica en ingles, redundante
con la manual.

Verificado renderizando a PDF con LibreOffice y revisando las paginas.

Co-Authored-By: Claude Sonnet 5 <noreply@anthropic.com>
</commit_message>
<xml_diff>
--- a/Cursos/QA/entregables/Plan_de_Pruebas_Fase2_QA.docx
+++ b/Cursos/QA/entregables/Plan_de_Pruebas_Fase2_QA.docx
@@ -2,32 +2,6 @@
 <file path=word/document.xml><?xml version="1.0" encoding="utf-8"?>
 <w:document xmlns:w="http://schemas.openxmlformats.org/wordprocessingml/2006/main" xmlns:m="http://schemas.openxmlformats.org/officeDocument/2006/math" xmlns:r="http://schemas.openxmlformats.org/officeDocument/2006/relationships" xmlns:o="urn:schemas-microsoft-com:office:office" xmlns:v="urn:schemas-microsoft-com:vml" xmlns:w10="urn:schemas-microsoft-com:office:word" xmlns:a="http://schemas.openxmlformats.org/drawingml/2006/main" xmlns:pic="http://schemas.openxmlformats.org/drawingml/2006/picture" xmlns:wp="http://schemas.openxmlformats.org/drawingml/2006/wordprocessingDrawing">
   <w:body>
-    <w:sdt>
-      <w:sdtPr>
-        <w:docPartObj>
-          <w:docPartGallery w:val="Table of Contents"/>
-          <w:docPartUnique/>
-        </w:docPartObj>
-      </w:sdtPr>
-      <w:sdtContent>
-        <w:p>
-          <w:pPr>
-            <w:pStyle w:val="TOCHeading"/>
-          </w:pPr>
-          <w:r>
-            <w:t xml:space="preserve">Table of Contents</w:t>
-          </w:r>
-        </w:p>
-        <w:p>
-          <w:r>
-            <w:fldChar w:fldCharType="begin" w:dirty="true"/>
-            <w:instrText xml:space="preserve">TOC \o "1-2" \h \z \u</w:instrText>
-            <w:fldChar w:fldCharType="separate"/>
-            <w:fldChar w:fldCharType="end"/>
-          </w:r>
-        </w:p>
-      </w:sdtContent>
-    </w:sdt>
     <w:bookmarkStart w:id="26" w:name="plan-de-pruebas-fase-2"/>
     <w:p>
       <w:pPr>
@@ -11423,6 +11397,8 @@
       <w:footnotePr>
         <w:numRestart w:val="eachSect"/>
       </w:footnotePr>
+      <w:pgSz w:w="15840" w:h="12240" w:orient="landscape"/>
+      <w:pgMar w:top="1080" w:right="720" w:bottom="1080" w:left="720" w:header="720" w:footer="720" w:gutter="0"/>
     </w:sectPr>
   </w:body>
 </w:document>

</xml_diff>

<commit_message>
docs(QA): completar nombres del equipo en el Plan de pruebas
Marcos Eduardo Zamora Sanchez, Kevin Said Reyes Quesada, Diana Carolina
Camacho Jimenez -- confirmados 2026-09-18, sin carne. Quedan pendientes
solo institucion/sede, escuela/carrera, codigo del curso y grupo.

Co-Authored-By: Claude Sonnet 5 <noreply@anthropic.com>
</commit_message>
<xml_diff>
--- a/Cursos/QA/entregables/Plan_de_Pruebas_Fase2_QA.docx
+++ b/Cursos/QA/entregables/Plan_de_Pruebas_Fase2_QA.docx
@@ -187,7 +187,7 @@
         </w:numPr>
       </w:pPr>
       <w:r>
-        <w:t xml:space="preserve">[COMPLETAR: nombre completo — carné] (Persona 1 — Auth + Profile)</w:t>
+        <w:t xml:space="preserve">Marcos Eduardo Zamora Sánchez (Persona 1 — Auth + Profile)</w:t>
       </w:r>
     </w:p>
     <w:p>
@@ -199,7 +199,7 @@
         </w:numPr>
       </w:pPr>
       <w:r>
-        <w:t xml:space="preserve">[COMPLETAR: nombre completo — carné] (Persona 2 — Transaction + Category)</w:t>
+        <w:t xml:space="preserve">Kevin Said Reyes Quesada (Persona 2 — Transaction + Category)</w:t>
       </w:r>
     </w:p>
     <w:p>
@@ -211,7 +211,7 @@
         </w:numPr>
       </w:pPr>
       <w:r>
-        <w:t xml:space="preserve">[COMPLETAR: nombre completo — carné] (Persona 3 — Account + Budget)</w:t>
+        <w:t xml:space="preserve">Diana Carolina Camacho Jiménez (Persona 3 — Account + Budget)</w:t>
       </w:r>
     </w:p>
     <w:p>

</xml_diff>